<commit_message>
V.1.4 - FULL VERSION
</commit_message>
<xml_diff>
--- a/dist/CODS/_internal/templates/คำพิพากษาตามยอม.docx
+++ b/dist/CODS/_internal/templates/คำพิพากษาตามยอม.docx
@@ -2085,13 +2085,14 @@
         <w:tblLook w:val="04A0" w:firstRow="1" w:lastRow="0" w:firstColumn="1" w:lastColumn="0" w:noHBand="0" w:noVBand="1"/>
       </w:tblPr>
       <w:tblGrid>
-        <w:gridCol w:w="4478"/>
-        <w:gridCol w:w="4594"/>
+        <w:gridCol w:w="4603"/>
+        <w:gridCol w:w="3301"/>
+        <w:gridCol w:w="1168"/>
       </w:tblGrid>
       <w:tr>
         <w:tc>
           <w:tcPr>
-            <w:tcW w:w="4644" w:type="dxa"/>
+            <w:tcW w:w="7508" w:type="dxa"/>
           </w:tcPr>
           <w:p>
             <w:pPr>
@@ -2112,7 +2113,7 @@
         </w:tc>
         <w:tc>
           <w:tcPr>
-            <w:tcW w:w="4644" w:type="dxa"/>
+            <w:tcW w:w="284" w:type="dxa"/>
           </w:tcPr>
           <w:p>
             <w:pPr>
@@ -2138,7 +2139,7 @@
                 <w:szCs w:val="34"/>
                 <w:cs/>
               </w:rPr>
-              <w:t>........................................................ผู้พิพากษา</w:t>
+              <w:t>........................................................</w:t>
             </w:r>
             <w:r>
               <w:rPr>
@@ -2260,11 +2261,41 @@
             </w:pPr>
           </w:p>
         </w:tc>
+        <w:tc>
+          <w:tcPr>
+            <w:tcW w:w="1270" w:type="dxa"/>
+          </w:tcPr>
+          <w:p>
+            <w:pPr>
+              <w:pStyle w:val="Footer"/>
+              <w:tabs>
+                <w:tab w:val="clear" w:pos="4153"/>
+                <w:tab w:val="clear" w:pos="8306"/>
+                <w:tab w:val="left" w:pos="1134"/>
+              </w:tabs>
+              <w:jc w:val="right"/>
+              <w:rPr>
+                <w:rFonts w:ascii="TH SarabunIT๙" w:hAnsi="TH SarabunIT๙" w:cs="TH SarabunIT๙"/>
+                <w:sz w:val="34"/>
+                <w:szCs w:val="34"/>
+              </w:rPr>
+            </w:pPr>
+            <w:r>
+              <w:rPr>
+                <w:rFonts w:ascii="TH SarabunIT๙" w:hAnsi="TH SarabunIT๙" w:cs="TH SarabunIT๙"/>
+                <w:sz w:val="34"/>
+                <w:szCs w:val="34"/>
+                <w:cs/>
+              </w:rPr>
+              <w:t>ผู้พิพากษา</w:t>
+            </w:r>
+          </w:p>
+        </w:tc>
       </w:tr>
       <w:tr>
         <w:tc>
           <w:tcPr>
-            <w:tcW w:w="4644" w:type="dxa"/>
+            <w:tcW w:w="7508" w:type="dxa"/>
           </w:tcPr>
           <w:p>
             <w:pPr>
@@ -2285,7 +2316,7 @@
         </w:tc>
         <w:tc>
           <w:tcPr>
-            <w:tcW w:w="4644" w:type="dxa"/>
+            <w:tcW w:w="284" w:type="dxa"/>
           </w:tcPr>
           <w:p>
             <w:pPr>
@@ -2309,7 +2340,7 @@
                 <w:szCs w:val="34"/>
                 <w:cs/>
               </w:rPr>
-              <w:t>........................................................ผู้พิพากษา</w:t>
+              <w:t>........................................................</w:t>
             </w:r>
             <w:r>
               <w:rPr>
@@ -2410,6 +2441,36 @@
               <w:t>)</w:t>
             </w:r>
             <w:bookmarkEnd w:id="0"/>
+          </w:p>
+        </w:tc>
+        <w:tc>
+          <w:tcPr>
+            <w:tcW w:w="1270" w:type="dxa"/>
+          </w:tcPr>
+          <w:p>
+            <w:pPr>
+              <w:pStyle w:val="Footer"/>
+              <w:tabs>
+                <w:tab w:val="clear" w:pos="4153"/>
+                <w:tab w:val="clear" w:pos="8306"/>
+                <w:tab w:val="left" w:pos="1134"/>
+              </w:tabs>
+              <w:jc w:val="right"/>
+              <w:rPr>
+                <w:rFonts w:ascii="TH SarabunIT๙" w:hAnsi="TH SarabunIT๙" w:cs="TH SarabunIT๙"/>
+                <w:sz w:val="34"/>
+                <w:szCs w:val="34"/>
+              </w:rPr>
+            </w:pPr>
+            <w:r>
+              <w:rPr>
+                <w:rFonts w:ascii="TH SarabunIT๙" w:hAnsi="TH SarabunIT๙" w:cs="TH SarabunIT๙"/>
+                <w:sz w:val="34"/>
+                <w:szCs w:val="34"/>
+                <w:cs/>
+              </w:rPr>
+              <w:t>ผู้พิพากษา</w:t>
+            </w:r>
           </w:p>
         </w:tc>
       </w:tr>
@@ -2420,7 +2481,7 @@
           <w:tab w:val="left" w:pos="4536"/>
         </w:tabs>
         <w:rPr>
-          <w:rFonts w:ascii="TH SarabunIT๙" w:hAnsi="TH SarabunIT๙" w:cs="TH SarabunIT๙"/>
+          <w:rFonts w:ascii="TH SarabunIT๙" w:hAnsi="TH SarabunIT๙" w:cs="TH SarabunIT๙" w:hint="cs"/>
           <w:b/>
           <w:bCs/>
           <w:sz w:val="44"/>

</xml_diff>